<commit_message>
Add initial version of cheatsheet document for Urok09
</commit_message>
<xml_diff>
--- a/urok21/Уроки_21-22_ML_конспект.docx
+++ b/urok21/Уроки_21-22_ML_конспект.docx
@@ -75,7 +75,7 @@
           <w:sz w:val="20"/>
           <w:szCs w:val="20"/>
         </w:rPr>
-        <w:t xml:space="preserve">Фаза 6 · Финальный проект · Недели 11–12</w:t>
+        <w:t xml:space="preserve">Фаза 4 · Финальный проект · Недели 11–12</w:t>
       </w:r>
     </w:p>
     <w:p>
@@ -124,7 +124,7 @@
           <w:sz w:val="22"/>
           <w:szCs w:val="22"/>
         </w:rPr>
-        <w:t xml:space="preserve">90 минут · Финальный проект · Фаза 6, Неделя 11</w:t>
+        <w:t xml:space="preserve">90 минут · Финальный проект · Фаза 4, Неделя 11</w:t>
       </w:r>
     </w:p>
     <w:p>
@@ -917,7 +917,7 @@
           <w:sz w:val="22"/>
           <w:szCs w:val="22"/>
         </w:rPr>
-        <w:t xml:space="preserve">Пример на табличных данных (Titanic). Свою задачу ученик подставляет по аналогии; для текста/картинок — та же логика (baseline → Pipeline).</w:t>
+        <w:t xml:space="preserve">Пример на табличных данных (Palmer Penguins). Свою задачу ученик подставляет по аналогии. Для текстовых проектов — та же логика: TfidfVectorizer → Pipeline (см. текстовый вариант ниже).</w:t>
       </w:r>
     </w:p>
     <w:p>
@@ -1028,64 +1028,64 @@
           <w:sz w:val="19"/>
           <w:szCs w:val="19"/>
         </w:rPr>
-        <w:t xml:space="preserve">df = sns.load_dataset('titanic')          # замени на свой датасет</w:t>
-      </w:r>
-    </w:p>
-    <w:p>
-      <w:pPr>
-        <w:pBdr>
-          <w:left w:val="single" w:color="D9D6F0" w:sz="24" w:space="8"/>
-          <w:right w:val="single" w:color="F2F1FA" w:sz="6" w:space="4"/>
-        </w:pBdr>
-        <w:shd w:fill="F2F1FA" w:color="auto" w:val="clear"/>
-        <w:spacing w:after="0" w:line="250"/>
-      </w:pPr>
-      <w:r>
-        <w:rPr>
-          <w:rFonts w:ascii="Consolas" w:cs="Consolas" w:eastAsia="Consolas" w:hAnsi="Consolas"/>
-          <w:color w:val="23233A"/>
-          <w:sz w:val="19"/>
-          <w:szCs w:val="19"/>
-        </w:rPr>
-        <w:t xml:space="preserve">num = ['age','fare','sibsp','parch']       # свои числовые признаки</w:t>
-      </w:r>
-    </w:p>
-    <w:p>
-      <w:pPr>
-        <w:pBdr>
-          <w:left w:val="single" w:color="D9D6F0" w:sz="24" w:space="8"/>
-          <w:right w:val="single" w:color="F2F1FA" w:sz="6" w:space="4"/>
-        </w:pBdr>
-        <w:shd w:fill="F2F1FA" w:color="auto" w:val="clear"/>
-        <w:spacing w:after="0" w:line="250"/>
-      </w:pPr>
-      <w:r>
-        <w:rPr>
-          <w:rFonts w:ascii="Consolas" w:cs="Consolas" w:eastAsia="Consolas" w:hAnsi="Consolas"/>
-          <w:color w:val="23233A"/>
-          <w:sz w:val="19"/>
-          <w:szCs w:val="19"/>
-        </w:rPr>
-        <w:t xml:space="preserve">cat = ['sex','pclass','embarked']          # свои категориальные признаки</w:t>
-      </w:r>
-    </w:p>
-    <w:p>
-      <w:pPr>
-        <w:pBdr>
-          <w:left w:val="single" w:color="D9D6F0" w:sz="24" w:space="8"/>
-          <w:right w:val="single" w:color="F2F1FA" w:sz="6" w:space="4"/>
-        </w:pBdr>
-        <w:shd w:fill="F2F1FA" w:color="auto" w:val="clear"/>
-        <w:spacing w:after="0" w:line="250"/>
-      </w:pPr>
-      <w:r>
-        <w:rPr>
-          <w:rFonts w:ascii="Consolas" w:cs="Consolas" w:eastAsia="Consolas" w:hAnsi="Consolas"/>
-          <w:color w:val="23233A"/>
-          <w:sz w:val="19"/>
-          <w:szCs w:val="19"/>
-        </w:rPr>
-        <w:t xml:space="preserve">X = df[num+cat]; y = df['survived']         # свой target</w:t>
+        <w:t xml:space="preserve">df = sns.load_dataset('penguins').drop(columns=['sex'])   # sex всегда убираем</w:t>
+      </w:r>
+    </w:p>
+    <w:p>
+      <w:pPr>
+        <w:pBdr>
+          <w:left w:val="single" w:color="D9D6F0" w:sz="24" w:space="8"/>
+          <w:right w:val="single" w:color="F2F1FA" w:sz="6" w:space="4"/>
+        </w:pBdr>
+        <w:shd w:fill="F2F1FA" w:color="auto" w:val="clear"/>
+        <w:spacing w:after="0" w:line="250"/>
+      </w:pPr>
+      <w:r>
+        <w:rPr>
+          <w:rFonts w:ascii="Consolas" w:cs="Consolas" w:eastAsia="Consolas" w:hAnsi="Consolas"/>
+          <w:color w:val="23233A"/>
+          <w:sz w:val="19"/>
+          <w:szCs w:val="19"/>
+        </w:rPr>
+        <w:t xml:space="preserve">num = ['bill_length_mm','bill_depth_mm','flipper_length_mm','body_mass_g']  # числовые</w:t>
+      </w:r>
+    </w:p>
+    <w:p>
+      <w:pPr>
+        <w:pBdr>
+          <w:left w:val="single" w:color="D9D6F0" w:sz="24" w:space="8"/>
+          <w:right w:val="single" w:color="F2F1FA" w:sz="6" w:space="4"/>
+        </w:pBdr>
+        <w:shd w:fill="F2F1FA" w:color="auto" w:val="clear"/>
+        <w:spacing w:after="0" w:line="250"/>
+      </w:pPr>
+      <w:r>
+        <w:rPr>
+          <w:rFonts w:ascii="Consolas" w:cs="Consolas" w:eastAsia="Consolas" w:hAnsi="Consolas"/>
+          <w:color w:val="23233A"/>
+          <w:sz w:val="19"/>
+          <w:szCs w:val="19"/>
+        </w:rPr>
+        <w:t xml:space="preserve">cat = ['island']                            # категориальные признаки</w:t>
+      </w:r>
+    </w:p>
+    <w:p>
+      <w:pPr>
+        <w:pBdr>
+          <w:left w:val="single" w:color="D9D6F0" w:sz="24" w:space="8"/>
+          <w:right w:val="single" w:color="F2F1FA" w:sz="6" w:space="4"/>
+        </w:pBdr>
+        <w:shd w:fill="F2F1FA" w:color="auto" w:val="clear"/>
+        <w:spacing w:after="0" w:line="250"/>
+      </w:pPr>
+      <w:r>
+        <w:rPr>
+          <w:rFonts w:ascii="Consolas" w:cs="Consolas" w:eastAsia="Consolas" w:hAnsi="Consolas"/>
+          <w:color w:val="23233A"/>
+          <w:sz w:val="19"/>
+          <w:szCs w:val="19"/>
+        </w:rPr>
+        <w:t xml:space="preserve">X = df[num+cat]; y = df['species']          # target (замени на свой)</w:t>
       </w:r>
     </w:p>
     <w:p>
@@ -1486,6 +1486,175 @@
     </w:p>
     <w:p>
       <w:pPr>
+        <w:spacing w:after="40" w:before="120"/>
+      </w:pPr>
+      <w:r>
+        <w:rPr>
+          <w:b/>
+          <w:bCs/>
+          <w:color w:val="3C3489"/>
+          <w:sz w:val="21"/>
+          <w:szCs w:val="21"/>
+        </w:rPr>
+        <w:t xml:space="preserve">▸ Текстовый вариант — если проект про тексты (sklearn Pipeline, не HF pipeline)</w:t>
+      </w:r>
+    </w:p>
+    <w:p>
+      <w:pPr>
+        <w:pBdr>
+          <w:top w:val="single" w:color="F2F1FA" w:sz="6" w:space="4"/>
+          <w:left w:val="single" w:color="D9D6F0" w:sz="24" w:space="8"/>
+          <w:right w:val="single" w:color="F2F1FA" w:sz="6" w:space="4"/>
+        </w:pBdr>
+        <w:shd w:fill="F2F1FA" w:color="auto" w:val="clear"/>
+        <w:spacing w:after="0" w:line="250"/>
+      </w:pPr>
+      <w:r>
+        <w:rPr>
+          <w:rFonts w:ascii="Consolas" w:cs="Consolas" w:eastAsia="Consolas" w:hAnsi="Consolas"/>
+          <w:color w:val="23233A"/>
+          <w:sz w:val="19"/>
+          <w:szCs w:val="19"/>
+        </w:rPr>
+        <w:t xml:space="preserve">from sklearn.feature_extraction.text import TfidfVectorizer</w:t>
+      </w:r>
+    </w:p>
+    <w:p>
+      <w:pPr>
+        <w:pBdr>
+          <w:left w:val="single" w:color="D9D6F0" w:sz="24" w:space="8"/>
+          <w:right w:val="single" w:color="F2F1FA" w:sz="6" w:space="4"/>
+        </w:pBdr>
+        <w:shd w:fill="F2F1FA" w:color="auto" w:val="clear"/>
+        <w:spacing w:after="0" w:line="250"/>
+      </w:pPr>
+      <w:r>
+        <w:rPr>
+          <w:rFonts w:ascii="Consolas" w:cs="Consolas" w:eastAsia="Consolas" w:hAnsi="Consolas"/>
+          <w:color w:val="23233A"/>
+          <w:sz w:val="19"/>
+          <w:szCs w:val="19"/>
+        </w:rPr>
+        <w:t xml:space="preserve">from sklearn.linear_model import LogisticRegression</w:t>
+      </w:r>
+    </w:p>
+    <w:p>
+      <w:pPr>
+        <w:pBdr>
+          <w:left w:val="single" w:color="D9D6F0" w:sz="24" w:space="8"/>
+          <w:right w:val="single" w:color="F2F1FA" w:sz="6" w:space="4"/>
+        </w:pBdr>
+        <w:shd w:fill="F2F1FA" w:color="auto" w:val="clear"/>
+        <w:spacing w:after="0" w:line="250"/>
+      </w:pPr>
+      <w:r>
+        <w:rPr>
+          <w:rFonts w:ascii="Consolas" w:cs="Consolas" w:eastAsia="Consolas" w:hAnsi="Consolas"/>
+          <w:color w:val="23233A"/>
+          <w:sz w:val="19"/>
+          <w:szCs w:val="19"/>
+        </w:rPr>
+        <w:t xml:space="preserve">from sklearn.pipeline import Pipeline   # sklearn Pipeline (с большой P!)</w:t>
+      </w:r>
+    </w:p>
+    <w:p>
+      <w:pPr>
+        <w:pBdr>
+          <w:left w:val="single" w:color="D9D6F0" w:sz="24" w:space="8"/>
+          <w:right w:val="single" w:color="F2F1FA" w:sz="6" w:space="4"/>
+        </w:pBdr>
+        <w:shd w:fill="F2F1FA" w:color="auto" w:val="clear"/>
+        <w:spacing w:after="0" w:line="250"/>
+      </w:pPr>
+      <w:r>
+        <w:rPr>
+          <w:rFonts w:ascii="Consolas" w:cs="Consolas" w:eastAsia="Consolas" w:hAnsi="Consolas"/>
+          <w:color w:val="23233A"/>
+          <w:sz w:val="19"/>
+          <w:szCs w:val="19"/>
+        </w:rPr>
+        <w:t xml:space="preserve"># X_tr, X_te — колонка с текстом; y_tr, y_te — метки классов</w:t>
+      </w:r>
+    </w:p>
+    <w:p>
+      <w:pPr>
+        <w:pBdr>
+          <w:left w:val="single" w:color="D9D6F0" w:sz="24" w:space="8"/>
+          <w:right w:val="single" w:color="F2F1FA" w:sz="6" w:space="4"/>
+        </w:pBdr>
+        <w:shd w:fill="F2F1FA" w:color="auto" w:val="clear"/>
+        <w:spacing w:after="0" w:line="250"/>
+      </w:pPr>
+      <w:r>
+        <w:rPr>
+          <w:rFonts w:ascii="Consolas" w:cs="Consolas" w:eastAsia="Consolas" w:hAnsi="Consolas"/>
+          <w:color w:val="23233A"/>
+          <w:sz w:val="19"/>
+          <w:szCs w:val="19"/>
+        </w:rPr>
+        <w:t xml:space="preserve">text_model = Pipeline([('tfidf', TfidfVectorizer()),</w:t>
+      </w:r>
+    </w:p>
+    <w:p>
+      <w:pPr>
+        <w:pBdr>
+          <w:left w:val="single" w:color="D9D6F0" w:sz="24" w:space="8"/>
+          <w:right w:val="single" w:color="F2F1FA" w:sz="6" w:space="4"/>
+        </w:pBdr>
+        <w:shd w:fill="F2F1FA" w:color="auto" w:val="clear"/>
+        <w:spacing w:after="0" w:line="250"/>
+      </w:pPr>
+      <w:r>
+        <w:rPr>
+          <w:rFonts w:ascii="Consolas" w:cs="Consolas" w:eastAsia="Consolas" w:hAnsi="Consolas"/>
+          <w:color w:val="23233A"/>
+          <w:sz w:val="19"/>
+          <w:szCs w:val="19"/>
+        </w:rPr>
+        <w:t xml:space="preserve">                       ('clf', LogisticRegression(max_iter=1000))])</w:t>
+      </w:r>
+    </w:p>
+    <w:p>
+      <w:pPr>
+        <w:pBdr>
+          <w:left w:val="single" w:color="D9D6F0" w:sz="24" w:space="8"/>
+          <w:right w:val="single" w:color="F2F1FA" w:sz="6" w:space="4"/>
+        </w:pBdr>
+        <w:shd w:fill="F2F1FA" w:color="auto" w:val="clear"/>
+        <w:spacing w:after="0" w:line="250"/>
+      </w:pPr>
+      <w:r>
+        <w:rPr>
+          <w:rFonts w:ascii="Consolas" w:cs="Consolas" w:eastAsia="Consolas" w:hAnsi="Consolas"/>
+          <w:color w:val="23233A"/>
+          <w:sz w:val="19"/>
+          <w:szCs w:val="19"/>
+        </w:rPr>
+        <w:t xml:space="preserve">text_model.fit(X_tr, y_tr)</w:t>
+      </w:r>
+    </w:p>
+    <w:p>
+      <w:pPr>
+        <w:pBdr>
+          <w:left w:val="single" w:color="D9D6F0" w:sz="24" w:space="8"/>
+          <w:bottom w:val="single" w:color="F2F1FA" w:sz="6" w:space="4"/>
+          <w:right w:val="single" w:color="F2F1FA" w:sz="6" w:space="4"/>
+        </w:pBdr>
+        <w:shd w:fill="F2F1FA" w:color="auto" w:val="clear"/>
+        <w:spacing w:after="0" w:line="250"/>
+      </w:pPr>
+      <w:r>
+        <w:rPr>
+          <w:rFonts w:ascii="Consolas" w:cs="Consolas" w:eastAsia="Consolas" w:hAnsi="Consolas"/>
+          <w:color w:val="23233A"/>
+          <w:sz w:val="19"/>
+          <w:szCs w:val="19"/>
+        </w:rPr>
+        <w:t xml:space="preserve">print(f'Текстовая модель: {text_model.score(X_te, y_te):.0%}')</w:t>
+      </w:r>
+    </w:p>
+    <w:p>
+      <w:pPr>
         <w:pStyle w:val="Heading2"/>
         <w:spacing w:after="120" w:before="260"/>
       </w:pPr>
@@ -1980,7 +2149,7 @@
           <w:sz w:val="22"/>
           <w:szCs w:val="22"/>
         </w:rPr>
-        <w:t xml:space="preserve">90 минут · Финальный проект · Фаза 6, Неделя 11</w:t>
+        <w:t xml:space="preserve">90 минут · Финальный проект · Фаза 4, Неделя 11</w:t>
       </w:r>
     </w:p>
     <w:p>
@@ -2932,64 +3101,64 @@
           <w:sz w:val="19"/>
           <w:szCs w:val="19"/>
         </w:rPr>
-        <w:t xml:space="preserve">def predict(age, fare, sex, pclass):</w:t>
-      </w:r>
-    </w:p>
-    <w:p>
-      <w:pPr>
-        <w:pBdr>
-          <w:left w:val="single" w:color="D9D6F0" w:sz="24" w:space="8"/>
-          <w:right w:val="single" w:color="F2F1FA" w:sz="6" w:space="4"/>
-        </w:pBdr>
-        <w:shd w:fill="F2F1FA" w:color="auto" w:val="clear"/>
-        <w:spacing w:after="0" w:line="250"/>
-      </w:pPr>
-      <w:r>
-        <w:rPr>
-          <w:rFonts w:ascii="Consolas" w:cs="Consolas" w:eastAsia="Consolas" w:hAnsi="Consolas"/>
-          <w:color w:val="23233A"/>
-          <w:sz w:val="19"/>
-          <w:szCs w:val="19"/>
-        </w:rPr>
-        <w:t xml:space="preserve">    row = pd.DataFrame([{'age':age,'fare':fare,'sibsp':0,'parch':0,</w:t>
-      </w:r>
-    </w:p>
-    <w:p>
-      <w:pPr>
-        <w:pBdr>
-          <w:left w:val="single" w:color="D9D6F0" w:sz="24" w:space="8"/>
-          <w:right w:val="single" w:color="F2F1FA" w:sz="6" w:space="4"/>
-        </w:pBdr>
-        <w:shd w:fill="F2F1FA" w:color="auto" w:val="clear"/>
-        <w:spacing w:after="0" w:line="250"/>
-      </w:pPr>
-      <w:r>
-        <w:rPr>
-          <w:rFonts w:ascii="Consolas" w:cs="Consolas" w:eastAsia="Consolas" w:hAnsi="Consolas"/>
-          <w:color w:val="23233A"/>
-          <w:sz w:val="19"/>
-          <w:szCs w:val="19"/>
-        </w:rPr>
-        <w:t xml:space="preserve">                         'sex':sex,'pclass':pclass,'embarked':'S'}])</w:t>
-      </w:r>
-    </w:p>
-    <w:p>
-      <w:pPr>
-        <w:pBdr>
-          <w:left w:val="single" w:color="D9D6F0" w:sz="24" w:space="8"/>
-          <w:right w:val="single" w:color="F2F1FA" w:sz="6" w:space="4"/>
-        </w:pBdr>
-        <w:shd w:fill="F2F1FA" w:color="auto" w:val="clear"/>
-        <w:spacing w:after="0" w:line="250"/>
-      </w:pPr>
-      <w:r>
-        <w:rPr>
-          <w:rFonts w:ascii="Consolas" w:cs="Consolas" w:eastAsia="Consolas" w:hAnsi="Consolas"/>
-          <w:color w:val="23233A"/>
-          <w:sz w:val="19"/>
-          <w:szCs w:val="19"/>
-        </w:rPr>
-        <w:t xml:space="preserve">    return 'выжил' if best.predict(row)[0]==1 else 'погиб'</w:t>
+        <w:t xml:space="preserve">def predict(bill_len, bill_dep, flipper, mass, island):</w:t>
+      </w:r>
+    </w:p>
+    <w:p>
+      <w:pPr>
+        <w:pBdr>
+          <w:left w:val="single" w:color="D9D6F0" w:sz="24" w:space="8"/>
+          <w:right w:val="single" w:color="F2F1FA" w:sz="6" w:space="4"/>
+        </w:pBdr>
+        <w:shd w:fill="F2F1FA" w:color="auto" w:val="clear"/>
+        <w:spacing w:after="0" w:line="250"/>
+      </w:pPr>
+      <w:r>
+        <w:rPr>
+          <w:rFonts w:ascii="Consolas" w:cs="Consolas" w:eastAsia="Consolas" w:hAnsi="Consolas"/>
+          <w:color w:val="23233A"/>
+          <w:sz w:val="19"/>
+          <w:szCs w:val="19"/>
+        </w:rPr>
+        <w:t xml:space="preserve">    row = pd.DataFrame([{'bill_length_mm':bill_len,'bill_depth_mm':bill_dep,</w:t>
+      </w:r>
+    </w:p>
+    <w:p>
+      <w:pPr>
+        <w:pBdr>
+          <w:left w:val="single" w:color="D9D6F0" w:sz="24" w:space="8"/>
+          <w:right w:val="single" w:color="F2F1FA" w:sz="6" w:space="4"/>
+        </w:pBdr>
+        <w:shd w:fill="F2F1FA" w:color="auto" w:val="clear"/>
+        <w:spacing w:after="0" w:line="250"/>
+      </w:pPr>
+      <w:r>
+        <w:rPr>
+          <w:rFonts w:ascii="Consolas" w:cs="Consolas" w:eastAsia="Consolas" w:hAnsi="Consolas"/>
+          <w:color w:val="23233A"/>
+          <w:sz w:val="19"/>
+          <w:szCs w:val="19"/>
+        </w:rPr>
+        <w:t xml:space="preserve">                         'flipper_length_mm':flipper,'body_mass_g':mass,'island':island}])</w:t>
+      </w:r>
+    </w:p>
+    <w:p>
+      <w:pPr>
+        <w:pBdr>
+          <w:left w:val="single" w:color="D9D6F0" w:sz="24" w:space="8"/>
+          <w:right w:val="single" w:color="F2F1FA" w:sz="6" w:space="4"/>
+        </w:pBdr>
+        <w:shd w:fill="F2F1FA" w:color="auto" w:val="clear"/>
+        <w:spacing w:after="0" w:line="250"/>
+      </w:pPr>
+      <w:r>
+        <w:rPr>
+          <w:rFonts w:ascii="Consolas" w:cs="Consolas" w:eastAsia="Consolas" w:hAnsi="Consolas"/>
+          <w:color w:val="23233A"/>
+          <w:sz w:val="19"/>
+          <w:szCs w:val="19"/>
+        </w:rPr>
+        <w:t xml:space="preserve">    return str(best.predict(row)[0])</w:t>
       </w:r>
     </w:p>
     <w:p>
@@ -3046,45 +3215,45 @@
           <w:sz w:val="19"/>
           <w:szCs w:val="19"/>
         </w:rPr>
-        <w:t xml:space="preserve">    inputs=[gr.Number(label='Возраст'), gr.Number(label='Цена билета'),</w:t>
-      </w:r>
-    </w:p>
-    <w:p>
-      <w:pPr>
-        <w:pBdr>
-          <w:left w:val="single" w:color="D9D6F0" w:sz="24" w:space="8"/>
-          <w:right w:val="single" w:color="F2F1FA" w:sz="6" w:space="4"/>
-        </w:pBdr>
-        <w:shd w:fill="F2F1FA" w:color="auto" w:val="clear"/>
-        <w:spacing w:after="0" w:line="250"/>
-      </w:pPr>
-      <w:r>
-        <w:rPr>
-          <w:rFonts w:ascii="Consolas" w:cs="Consolas" w:eastAsia="Consolas" w:hAnsi="Consolas"/>
-          <w:color w:val="23233A"/>
-          <w:sz w:val="19"/>
-          <w:szCs w:val="19"/>
-        </w:rPr>
-        <w:t xml:space="preserve">            gr.Radio(['male','female'], label='Пол'), gr.Radio([1,2,3], label='Класс')],</w:t>
-      </w:r>
-    </w:p>
-    <w:p>
-      <w:pPr>
-        <w:pBdr>
-          <w:left w:val="single" w:color="D9D6F0" w:sz="24" w:space="8"/>
-          <w:right w:val="single" w:color="F2F1FA" w:sz="6" w:space="4"/>
-        </w:pBdr>
-        <w:shd w:fill="F2F1FA" w:color="auto" w:val="clear"/>
-        <w:spacing w:after="0" w:line="250"/>
-      </w:pPr>
-      <w:r>
-        <w:rPr>
-          <w:rFonts w:ascii="Consolas" w:cs="Consolas" w:eastAsia="Consolas" w:hAnsi="Consolas"/>
-          <w:color w:val="23233A"/>
-          <w:sz w:val="19"/>
-          <w:szCs w:val="19"/>
-        </w:rPr>
-        <w:t xml:space="preserve">    outputs=gr.Label(label='Прогноз'),</w:t>
+        <w:t xml:space="preserve">    inputs=[gr.Number(label='Длина клюва, мм'), gr.Number(label='Глубина клюва, мм'),</w:t>
+      </w:r>
+    </w:p>
+    <w:p>
+      <w:pPr>
+        <w:pBdr>
+          <w:left w:val="single" w:color="D9D6F0" w:sz="24" w:space="8"/>
+          <w:right w:val="single" w:color="F2F1FA" w:sz="6" w:space="4"/>
+        </w:pBdr>
+        <w:shd w:fill="F2F1FA" w:color="auto" w:val="clear"/>
+        <w:spacing w:after="0" w:line="250"/>
+      </w:pPr>
+      <w:r>
+        <w:rPr>
+          <w:rFonts w:ascii="Consolas" w:cs="Consolas" w:eastAsia="Consolas" w:hAnsi="Consolas"/>
+          <w:color w:val="23233A"/>
+          <w:sz w:val="19"/>
+          <w:szCs w:val="19"/>
+        </w:rPr>
+        <w:t xml:space="preserve">            gr.Number(label='Длина ласта, мм'), gr.Number(label='Масса, г'), gr.Radio(['Biscoe','Dream','Torgersen'], label='Остров')],</w:t>
+      </w:r>
+    </w:p>
+    <w:p>
+      <w:pPr>
+        <w:pBdr>
+          <w:left w:val="single" w:color="D9D6F0" w:sz="24" w:space="8"/>
+          <w:right w:val="single" w:color="F2F1FA" w:sz="6" w:space="4"/>
+        </w:pBdr>
+        <w:shd w:fill="F2F1FA" w:color="auto" w:val="clear"/>
+        <w:spacing w:after="0" w:line="250"/>
+      </w:pPr>
+      <w:r>
+        <w:rPr>
+          <w:rFonts w:ascii="Consolas" w:cs="Consolas" w:eastAsia="Consolas" w:hAnsi="Consolas"/>
+          <w:color w:val="23233A"/>
+          <w:sz w:val="19"/>
+          <w:szCs w:val="19"/>
+        </w:rPr>
+        <w:t xml:space="preserve">    outputs=gr.Label(label='Вид пингвина'),</w:t>
       </w:r>
     </w:p>
     <w:p>

</xml_diff>